<commit_message>
Close integrity, licensing, and evidence gaps
</commit_message>
<xml_diff>
--- a/deliverables/AQP_Evaluation_Matrix_v6.docx
+++ b/deliverables/AQP_Evaluation_Matrix_v6.docx
@@ -28,25 +28,25 @@
         <w:rPr>
           <w:rFonts w:ascii="Calibri" w:hAnsi="Calibri"/>
         </w:rPr>
-        <w:t xml:space="preserve">Version: 6.0</w:t>
+        <w:t xml:space="preserve">Version: 6.1</w:t>
       </w:r>
       <w:r>
         <w:rPr>
           <w:rFonts w:ascii="Calibri" w:hAnsi="Calibri"/>
         </w:rPr>
-        <w:br/>
+        <w:t xml:space="preserve"> </w:t>
       </w:r>
       <w:r>
         <w:rPr>
           <w:rFonts w:ascii="Calibri" w:hAnsi="Calibri"/>
         </w:rPr>
-        <w:t xml:space="preserve">Frozen: 2026-08-09</w:t>
+        <w:t xml:space="preserve">Revised: 2026-08-10</w:t>
       </w:r>
       <w:r>
         <w:rPr>
           <w:rFonts w:ascii="Calibri" w:hAnsi="Calibri"/>
         </w:rPr>
-        <w:br/>
+        <w:t xml:space="preserve"> </w:t>
       </w:r>
       <w:r>
         <w:rPr>
@@ -703,7 +703,7 @@
                 <w:b/>
                 <w:sz w:val="16"/>
               </w:rPr>
-              <w:t xml:space="preserve">Not evidenced yet for the release.</w:t>
+              <w:t xml:space="preserve">Not evidenced overall.</w:t>
             </w:r>
             <w:r>
               <w:rPr>
@@ -717,7 +717,7 @@
                 <w:rFonts w:ascii="Calibri" w:hAnsi="Calibri"/>
                 <w:sz w:val="16"/>
               </w:rPr>
-              <w:t xml:space="preserve">Browser suite is implemented but has not run in this local environment; manual audit protocol is frozen but all route cells remain NT. Therefore “accessible”, “more accessible” and disabled-user benefit claims are unavailable.</w:t>
+              <w:t xml:space="preserve">The previous PR revision completed all 60 rendered-browser scans with 0 violations, incomplete checks, overflow failures or target-size failures. The current correction candidate replaces the third-party UEQ-S state with a synthetic semantic-differential state and requires a fresh CI run. All manual route cells remain NT, so the combined C2 decision rule is not met. No general accessibility or disabled-user benefit claim is available.</w:t>
             </w:r>
           </w:p>
         </w:tc>
@@ -816,7 +816,7 @@
                 <w:rFonts w:ascii="Calibri" w:hAnsi="Calibri"/>
                 <w:sz w:val="16"/>
               </w:rPr>
-              <w:t xml:space="preserve">unequal expected/observed fields ÷ all independent-oracle comparisons, reported for every built-in instrument and every QSF/LSS/LSG/LSQ fixture.</w:t>
+              <w:t xml:space="preserve">unequal expected/observed fields ÷ all independent-oracle comparisons, reported for every distributable built-in instrument and every QSF/LSS/LSG/LSQ fixture.</w:t>
             </w:r>
           </w:p>
         </w:tc>
@@ -896,7 +896,7 @@
                 <w:b/>
                 <w:sz w:val="16"/>
               </w:rPr>
-              <w:t xml:space="preserve">Locally evidenced; release verification pending.</w:t>
+              <w:t xml:space="preserve">Evidenced locally for the correction candidate; release verification pending.</w:t>
             </w:r>
             <w:r>
               <w:rPr>
@@ -910,7 +910,7 @@
                 <w:rFonts w:ascii="Calibri" w:hAnsi="Calibri"/>
                 <w:sz w:val="16"/>
               </w:rPr>
-              <w:t xml:space="preserve">9 cases, 39 items, 288 field comparisons, 0 mismatches. Must be reproduced for the deployed commit.</w:t>
+              <w:t xml:space="preserve">8 cases, 31 items, 234 field comparisons, 0 mismatches. UEQ-S was removed from the distributable inventory because repository/deployment permission was not established. The result must be reproduced for final main and the deployed commit.</w:t>
             </w:r>
           </w:p>
         </w:tc>
@@ -1089,7 +1089,7 @@
                 <w:b/>
                 <w:sz w:val="16"/>
               </w:rPr>
-              <w:t xml:space="preserve">Locally evidenced; release verification pending.</w:t>
+              <w:t xml:space="preserve">Evidenced locally for the correction candidate; release verification pending.</w:t>
             </w:r>
             <w:r>
               <w:rPr>
@@ -1587,7 +1587,7 @@
                 <w:rFonts w:ascii="Calibri" w:hAnsi="Calibri"/>
                 <w:sz w:val="16"/>
               </w:rPr>
-              <w:t xml:space="preserve">matching canonical SHA-256 in configuration, recomputed loaded definition and submitted result ÷ tested cases; tampered configurations blocked ÷ tamper cases.</w:t>
+              <w:t xml:space="preserve">matching canonical SHA-256 in configuration, recomputed loaded definition and submitted result ÷ tested cases; Version 4 configurations and result records with a missing or mismatched fingerprint rejected ÷ tamper cases.</w:t>
             </w:r>
             <w:r>
               <w:rPr>
@@ -1643,7 +1643,7 @@
                 <w:rFonts w:ascii="Calibri" w:hAnsi="Calibri"/>
                 <w:sz w:val="16"/>
               </w:rPr>
-              <w:t xml:space="preserve">Hash agreement 100%; every hash mismatch blocks submission and cannot show success. Reconstruction 9/9 with 0 mismatches; every export contains the complete definition, scorer and responses needed without repository lookup.</w:t>
+              <w:t xml:space="preserve">Hash agreement 100%; every missing or mismatched Version 4 configuration/result fingerprint is rejected and cannot show or restore success. Reconstruction 8/8 with 0 mismatches; every export contains the complete definition, scorer and responses needed without repository lookup. This unsigned fingerprint establishes internal consistency, not authenticated authorship.</w:t>
             </w:r>
           </w:p>
         </w:tc>
@@ -1669,7 +1669,7 @@
                 <w:rFonts w:ascii="Calibri" w:hAnsi="Calibri"/>
                 <w:sz w:val="16"/>
               </w:rPr>
-              <w:t xml:space="preserve">Configuration/result schema tests; tampered-link tests; export reconstruction report.</w:t>
+              <w:t xml:space="preserve">Configuration/result schema tests; missing-hash and stale-hash tampered-link/result tests; submission-block test; export reconstruction report.</w:t>
             </w:r>
           </w:p>
         </w:tc>
@@ -1697,7 +1697,7 @@
                 <w:b/>
                 <w:sz w:val="16"/>
               </w:rPr>
-              <w:t xml:space="preserve">Locally evidenced; release verification pending.</w:t>
+              <w:t xml:space="preserve">Evidenced locally for the correction candidate; release verification pending.</w:t>
             </w:r>
             <w:r>
               <w:rPr>
@@ -1711,7 +1711,7 @@
                 <w:rFonts w:ascii="Calibri" w:hAnsi="Calibri"/>
                 <w:sz w:val="16"/>
               </w:rPr>
-              <w:t xml:space="preserve">Hash checks pass in unit/component tests; 9/9 exports and 39/39 item responses reconstructed with 0 mismatches. Must be reproduced and deployed before the claim is marked Evidenced.</w:t>
+              <w:t xml:space="preserve">Stale-hash and delete-the-hash tamper paths are rejected for both configuration loading and Version 4 stored-result recovery; 8/8 exports and 31/31 item responses reconstructed with 0 mismatches. Must be reproduced for final main and the deployed commit.</w:t>
             </w:r>
           </w:p>
         </w:tc>

</xml_diff>

<commit_message>
Record verified PR evidence
</commit_message>
<xml_diff>
--- a/deliverables/AQP_Evaluation_Matrix_v6.docx
+++ b/deliverables/AQP_Evaluation_Matrix_v6.docx
@@ -717,7 +717,36 @@
                 <w:rFonts w:ascii="Calibri" w:hAnsi="Calibri"/>
                 <w:sz w:val="16"/>
               </w:rPr>
-              <w:t xml:space="preserve">The previous PR revision completed all 60 rendered-browser scans with 0 violations, incomplete checks, overflow failures or target-size failures. The current correction candidate replaces the third-party UEQ-S state with a synthetic semantic-differential state and requires a fresh CI run. All manual route cells remain NT, so the combined C2 decision rule is not met. No general accessibility or disabled-user benefit claim is available.</w:t>
+              <w:t xml:space="preserve">PR CI run</w:t>
+            </w:r>
+            <w:r>
+              <w:rPr>
+                <w:rFonts w:ascii="Calibri" w:hAnsi="Calibri"/>
+                <w:sz w:val="16"/>
+              </w:rPr>
+              <w:t xml:space="preserve"> </w:t>
+            </w:r>
+            <w:r>
+              <w:rPr>
+                <w:rStyle w:val="VerbatimChar"/>
+                <w:rFonts w:ascii="Calibri" w:hAnsi="Calibri"/>
+                <w:sz w:val="16"/>
+              </w:rPr>
+              <w:t xml:space="preserve">31339674025</w:t>
+            </w:r>
+            <w:r>
+              <w:rPr>
+                <w:rFonts w:ascii="Calibri" w:hAnsi="Calibri"/>
+                <w:sz w:val="16"/>
+              </w:rPr>
+              <w:t xml:space="preserve"> </w:t>
+            </w:r>
+            <w:r>
+              <w:rPr>
+                <w:rFonts w:ascii="Calibri" w:hAnsi="Calibri"/>
+                <w:sz w:val="16"/>
+              </w:rPr>
+              <w:t xml:space="preserve">completed 60/60 browser scans for the synthetic semantic-differential correction candidate with 0 violations, incomplete checks, overflow failures, target-size failures or missing states. All manual route cells remain NT, so the combined C2 decision rule is not met. No general accessibility or disabled-user benefit claim is available.</w:t>
             </w:r>
           </w:p>
         </w:tc>
@@ -896,7 +925,7 @@
                 <w:b/>
                 <w:sz w:val="16"/>
               </w:rPr>
-              <w:t xml:space="preserve">Evidenced locally for the correction candidate; release verification pending.</w:t>
+              <w:t xml:space="preserve">Evidenced in PR CI; final release verification pending.</w:t>
             </w:r>
             <w:r>
               <w:rPr>
@@ -910,7 +939,36 @@
                 <w:rFonts w:ascii="Calibri" w:hAnsi="Calibri"/>
                 <w:sz w:val="16"/>
               </w:rPr>
-              <w:t xml:space="preserve">8 cases, 31 items, 234 field comparisons, 0 mismatches. UEQ-S was removed from the distributable inventory because repository/deployment permission was not established. The result must be reproduced for final main and the deployed commit.</w:t>
+              <w:t xml:space="preserve">Run</w:t>
+            </w:r>
+            <w:r>
+              <w:rPr>
+                <w:rFonts w:ascii="Calibri" w:hAnsi="Calibri"/>
+                <w:sz w:val="16"/>
+              </w:rPr>
+              <w:t xml:space="preserve"> </w:t>
+            </w:r>
+            <w:r>
+              <w:rPr>
+                <w:rStyle w:val="VerbatimChar"/>
+                <w:rFonts w:ascii="Calibri" w:hAnsi="Calibri"/>
+                <w:sz w:val="16"/>
+              </w:rPr>
+              <w:t xml:space="preserve">31339674025</w:t>
+            </w:r>
+            <w:r>
+              <w:rPr>
+                <w:rFonts w:ascii="Calibri" w:hAnsi="Calibri"/>
+                <w:sz w:val="16"/>
+              </w:rPr>
+              <w:t xml:space="preserve"> </w:t>
+            </w:r>
+            <w:r>
+              <w:rPr>
+                <w:rFonts w:ascii="Calibri" w:hAnsi="Calibri"/>
+                <w:sz w:val="16"/>
+              </w:rPr>
+              <w:t xml:space="preserve">recorded 8 cases, 31 items, 234 field comparisons and 0 mismatches. UEQ-S was removed because repository/deployment permission was not established. Final main and the deployed commit must reproduce the result.</w:t>
             </w:r>
           </w:p>
         </w:tc>
@@ -1089,7 +1147,7 @@
                 <w:b/>
                 <w:sz w:val="16"/>
               </w:rPr>
-              <w:t xml:space="preserve">Evidenced locally for the correction candidate; release verification pending.</w:t>
+              <w:t xml:space="preserve">Evidenced in PR CI; final release verification pending.</w:t>
             </w:r>
             <w:r>
               <w:rPr>
@@ -1103,7 +1161,36 @@
                 <w:rFonts w:ascii="Calibri" w:hAnsi="Calibri"/>
                 <w:sz w:val="16"/>
               </w:rPr>
-              <w:t xml:space="preserve">10 specific refusals, 2 generic parse refusals, 0 accepted documented losses, 0 silently altered.</w:t>
+              <w:t xml:space="preserve">Run</w:t>
+            </w:r>
+            <w:r>
+              <w:rPr>
+                <w:rFonts w:ascii="Calibri" w:hAnsi="Calibri"/>
+                <w:sz w:val="16"/>
+              </w:rPr>
+              <w:t xml:space="preserve"> </w:t>
+            </w:r>
+            <w:r>
+              <w:rPr>
+                <w:rStyle w:val="VerbatimChar"/>
+                <w:rFonts w:ascii="Calibri" w:hAnsi="Calibri"/>
+                <w:sz w:val="16"/>
+              </w:rPr>
+              <w:t xml:space="preserve">31339674025</w:t>
+            </w:r>
+            <w:r>
+              <w:rPr>
+                <w:rFonts w:ascii="Calibri" w:hAnsi="Calibri"/>
+                <w:sz w:val="16"/>
+              </w:rPr>
+              <w:t xml:space="preserve"> </w:t>
+            </w:r>
+            <w:r>
+              <w:rPr>
+                <w:rFonts w:ascii="Calibri" w:hAnsi="Calibri"/>
+                <w:sz w:val="16"/>
+              </w:rPr>
+              <w:t xml:space="preserve">recorded 10 specific refusals, 2 generic parse refusals, 0 accepted documented losses and 0 silently altered.</w:t>
             </w:r>
           </w:p>
         </w:tc>
@@ -1697,7 +1784,7 @@
                 <w:b/>
                 <w:sz w:val="16"/>
               </w:rPr>
-              <w:t xml:space="preserve">Evidenced locally for the correction candidate; release verification pending.</w:t>
+              <w:t xml:space="preserve">Evidenced in PR CI; final release verification pending.</w:t>
             </w:r>
             <w:r>
               <w:rPr>
@@ -1711,7 +1798,36 @@
                 <w:rFonts w:ascii="Calibri" w:hAnsi="Calibri"/>
                 <w:sz w:val="16"/>
               </w:rPr>
-              <w:t xml:space="preserve">Stale-hash and delete-the-hash tamper paths are rejected for both configuration loading and Version 4 stored-result recovery; 8/8 exports and 31/31 item responses reconstructed with 0 mismatches. Must be reproduced for final main and the deployed commit.</w:t>
+              <w:t xml:space="preserve">Run</w:t>
+            </w:r>
+            <w:r>
+              <w:rPr>
+                <w:rFonts w:ascii="Calibri" w:hAnsi="Calibri"/>
+                <w:sz w:val="16"/>
+              </w:rPr>
+              <w:t xml:space="preserve"> </w:t>
+            </w:r>
+            <w:r>
+              <w:rPr>
+                <w:rStyle w:val="VerbatimChar"/>
+                <w:rFonts w:ascii="Calibri" w:hAnsi="Calibri"/>
+                <w:sz w:val="16"/>
+              </w:rPr>
+              <w:t xml:space="preserve">31339674025</w:t>
+            </w:r>
+            <w:r>
+              <w:rPr>
+                <w:rFonts w:ascii="Calibri" w:hAnsi="Calibri"/>
+                <w:sz w:val="16"/>
+              </w:rPr>
+              <w:t xml:space="preserve"> </w:t>
+            </w:r>
+            <w:r>
+              <w:rPr>
+                <w:rFonts w:ascii="Calibri" w:hAnsi="Calibri"/>
+                <w:sz w:val="16"/>
+              </w:rPr>
+              <w:t xml:space="preserve">passed stale-hash and delete-the-hash configuration/result tests and reconstructed 8/8 exports and 31/31 item responses with 0 mismatches. Final main and the deployed commit must reproduce the result.</w:t>
             </w:r>
           </w:p>
         </w:tc>

</xml_diff>

<commit_message>
Quantify evidence and make review edits transactional
- make review changes transactional across save, cancel, recovery, and score state
- give per-item change controls unique visible, accessible, and gaze labels
- add component and browser regression coverage for cancel and save paths
- quantify the technical evaluation and update versioned evidence documents
</commit_message>
<xml_diff>
--- a/deliverables/AQP_Evaluation_Matrix_v6.docx
+++ b/deliverables/AQP_Evaluation_Matrix_v6.docx
@@ -28,7 +28,7 @@
         <w:rPr>
           <w:rFonts w:ascii="Calibri" w:hAnsi="Calibri"/>
         </w:rPr>
-        <w:t xml:space="preserve">Version: 6.1</w:t>
+        <w:t xml:space="preserve">Version: 6.2</w:t>
       </w:r>
       <w:r>
         <w:rPr>
@@ -326,7 +326,7 @@
                 <w:b/>
                 <w:sz w:val="16"/>
               </w:rPr>
-              <w:t xml:space="preserve">Compatible-definition isolation:</w:t>
+              <w:t xml:space="preserve">Compatible data-only admission:</w:t>
             </w:r>
             <w:r>
               <w:rPr>
@@ -340,7 +340,7 @@
                 <w:rFonts w:ascii="Calibri" w:hAnsi="Calibri"/>
                 <w:sz w:val="16"/>
               </w:rPr>
-              <w:t xml:space="preserve">production files changed outside definition/registration for a compatible definition ÷ all changed production files.</w:t>
+              <w:t xml:space="preserve">compatible imported definitions completing the shared production path, with instrument-specific production extension files required reported separately.</w:t>
             </w:r>
             <w:r>
               <w:rPr>
@@ -370,7 +370,7 @@
                 <w:rFonts w:ascii="Calibri" w:hAnsi="Calibri"/>
                 <w:sz w:val="16"/>
               </w:rPr>
-              <w:t xml:space="preserve">common runner/recovery/result tests executed unchanged across at least two definitions ÷ frozen common contracts.</w:t>
+              <w:t xml:space="preserve">completed case × contract executions ÷ all required case × contract executions, using one unchanged 12-contract function.</w:t>
             </w:r>
             <w:r>
               <w:rPr>
@@ -400,7 +400,7 @@
                 <w:rFonts w:ascii="Calibri" w:hAnsi="Calibri"/>
                 <w:sz w:val="16"/>
               </w:rPr>
-              <w:t xml:space="preserve">observed support state matching each definition declaration ÷ checked definition × support × state combinations.</w:t>
+              <w:t xml:space="preserve">declaration, rendered control and configuration gate agreeing ÷ checked definition × support combinations.</w:t>
             </w:r>
           </w:p>
         </w:tc>
@@ -426,7 +426,7 @@
                 <w:rFonts w:ascii="Calibri" w:hAnsi="Calibri"/>
                 <w:sz w:val="16"/>
               </w:rPr>
-              <w:t xml:space="preserve">Isolation is 0% outside definition/registration for a compatible definition; 100% of eligible common contracts are reused; allowlist agreement is 100%. A new scorer or response structure is reported as executable boundary extension, not a data-only platform pass.</w:t>
+              <w:t xml:space="preserve">At least two compatible definitions complete with 0 instrument-specific production extension files; shared contract reuse is 100% with 0 instrument-specific contract copies; allowlist agreement is 100%. A new scorer or response structure is reported as executable boundary extension, not a data-only platform pass.</w:t>
             </w:r>
           </w:p>
         </w:tc>
@@ -452,7 +452,7 @@
                 <w:rFonts w:ascii="Calibri" w:hAnsi="Calibri"/>
                 <w:sz w:val="16"/>
               </w:rPr>
-              <w:t xml:space="preserve">Architecture/contract tests; allowlist tests; change manifest for a compatible fixture.</w:t>
+              <w:t xml:space="preserve">Quantified production-path reuse/allowlist test and machine-readable technical report.</w:t>
             </w:r>
           </w:p>
         </w:tc>
@@ -480,7 +480,7 @@
                 <w:b/>
                 <w:sz w:val="16"/>
               </w:rPr>
-              <w:t xml:space="preserve">Partially evidenced.</w:t>
+              <w:t xml:space="preserve">Evidenced locally; PR/final-release verification pending.</w:t>
             </w:r>
             <w:r>
               <w:rPr>
@@ -494,7 +494,7 @@
                 <w:rFonts w:ascii="Calibri" w:hAnsi="Calibri"/>
                 <w:sz w:val="16"/>
               </w:rPr>
-              <w:t xml:space="preserve">Shared mechanisms and gates are implemented and tested across current definitions, but a frozen change-manifest experiment and final per-metric counts must be published for the release. The broader “questionnaire-independent” claim is withdrawn.</w:t>
+              <w:t xml:space="preserve">Five imported definitions completed as data with 0 instrument-specific production files, 96/96 shared case-contract executions used one function with 0 copies, and 16/16 allowlist combinations matched. The broader “questionnaire-independent” claim is withdrawn.</w:t>
             </w:r>
           </w:p>
         </w:tc>
@@ -593,7 +593,7 @@
                 <w:rFonts w:ascii="Calibri" w:hAnsi="Calibri"/>
                 <w:sz w:val="16"/>
               </w:rPr>
-              <w:t xml:space="preserve">passed state/profile scans ÷ 60 required scans (12 states × 5 profiles), with axe violations, incomplete checks, overflow and target size reported.</w:t>
+              <w:t xml:space="preserve">passed state/profile scans ÷ 135 required scans (27 structurally distinct states × 5 profiles), with axe violations, incomplete checks, overflow and target size reported. Fixture-induced external-service/hardware states are identified row by row.</w:t>
             </w:r>
             <w:r>
               <w:rPr>
@@ -649,7 +649,7 @@
                 <w:rFonts w:ascii="Calibri" w:hAnsi="Calibri"/>
                 <w:sz w:val="16"/>
               </w:rPr>
-              <w:t xml:space="preserve">All 60 browser scans present; 0 automatically detected violations; 0 overflow failures; 0 critical target-size failures; incomplete axe checks listed. Manual audit has 0 NT cells, every applicable cell P/F, and no S3 failure in a technically supported route. A markup mechanism that is not usefully announced is F.</w:t>
+              <w:t xml:space="preserve">All 135 browser scans present; 0 automatically detected violations; 0 overflow failures; 0 critical target-size failures; incomplete axe checks listed. Manual audit has 0 NT cells, every applicable cell P/F, and no S3 failure in a technically supported route. A markup mechanism that is not usefully announced is F.</w:t>
             </w:r>
           </w:p>
         </w:tc>
@@ -675,7 +675,7 @@
                 <w:rFonts w:ascii="Calibri" w:hAnsi="Calibri"/>
                 <w:sz w:val="16"/>
               </w:rPr>
-              <w:t xml:space="preserve">Playwright/axe JSON+HTML and trace artefact; cross-browser matrix; versioned manual AT audit.</w:t>
+              <w:t xml:space="preserve">Frozen runner-state inventory; Playwright/axe JSON+HTML and trace artefact; cross-browser matrix; versioned manual AT audit.</w:t>
             </w:r>
           </w:p>
         </w:tc>
@@ -717,36 +717,7 @@
                 <w:rFonts w:ascii="Calibri" w:hAnsi="Calibri"/>
                 <w:sz w:val="16"/>
               </w:rPr>
-              <w:t xml:space="preserve">PR CI run</w:t>
-            </w:r>
-            <w:r>
-              <w:rPr>
-                <w:rFonts w:ascii="Calibri" w:hAnsi="Calibri"/>
-                <w:sz w:val="16"/>
-              </w:rPr>
-              <w:t xml:space="preserve"> </w:t>
-            </w:r>
-            <w:r>
-              <w:rPr>
-                <w:rStyle w:val="VerbatimChar"/>
-                <w:rFonts w:ascii="Calibri" w:hAnsi="Calibri"/>
-                <w:sz w:val="16"/>
-              </w:rPr>
-              <w:t xml:space="preserve">31339674025</w:t>
-            </w:r>
-            <w:r>
-              <w:rPr>
-                <w:rFonts w:ascii="Calibri" w:hAnsi="Calibri"/>
-                <w:sz w:val="16"/>
-              </w:rPr>
-              <w:t xml:space="preserve"> </w:t>
-            </w:r>
-            <w:r>
-              <w:rPr>
-                <w:rFonts w:ascii="Calibri" w:hAnsi="Calibri"/>
-                <w:sz w:val="16"/>
-              </w:rPr>
-              <w:t xml:space="preserve">completed 60/60 browser scans for the synthetic semantic-differential correction candidate with 0 violations, incomplete checks, overflow failures, target-size failures or missing states. All manual route cells remain NT, so the combined C2 decision rule is not met. No general accessibility or disabled-user benefit claim is available.</w:t>
+              <w:t xml:space="preserve">The earlier 60-scan run does not meet the expanded every-screen inventory. The 135-scan candidate is awaiting PR CI, and all manual route cells remain NT. No general accessibility or disabled-user benefit claim is available.</w:t>
             </w:r>
           </w:p>
         </w:tc>
@@ -845,7 +816,7 @@
                 <w:rFonts w:ascii="Calibri" w:hAnsi="Calibri"/>
                 <w:sz w:val="16"/>
               </w:rPr>
-              <w:t xml:space="preserve">unequal expected/observed fields ÷ all independent-oracle comparisons, reported for every distributable built-in instrument and every QSF/LSS/LSG/LSQ fixture.</w:t>
+              <w:t xml:space="preserve">unequal expected/observed fields ÷ all independent-oracle comparisons, reported for each of the three distributable built-ins in this candidate and every QSF/LSS/LSG/LSQ fixture.</w:t>
             </w:r>
           </w:p>
         </w:tc>
@@ -871,7 +842,7 @@
                 <w:rFonts w:ascii="Calibri" w:hAnsi="Calibri"/>
                 <w:sz w:val="16"/>
               </w:rPr>
-              <w:t xml:space="preserve">0 mismatches in every case. One missing, reordered, relabelled, revalued or differently scored field fails the release.</w:t>
+              <w:t xml:space="preserve">0 mismatches in every case. One missing, reordered, relabelled, revalued or differently scored field fails the release. A removed instrument is a disclosed scope change, not counted as a pass.</w:t>
             </w:r>
           </w:p>
         </w:tc>
@@ -925,7 +896,7 @@
                 <w:b/>
                 <w:sz w:val="16"/>
               </w:rPr>
-              <w:t xml:space="preserve">Evidenced in PR CI; final release verification pending.</w:t>
+              <w:t xml:space="preserve">Evidenced locally and in the last passing PR revision; final PR/release verification pending.</w:t>
             </w:r>
             <w:r>
               <w:rPr>
@@ -939,7 +910,7 @@
                 <w:rFonts w:ascii="Calibri" w:hAnsi="Calibri"/>
                 <w:sz w:val="16"/>
               </w:rPr>
-              <w:t xml:space="preserve">Run</w:t>
+              <w:t xml:space="preserve">Eight cases, 31 items and 234 field comparisons produced 0 mismatches. This does</w:t>
             </w:r>
             <w:r>
               <w:rPr>
@@ -950,11 +921,12 @@
             </w:r>
             <w:r>
               <w:rPr>
-                <w:rStyle w:val="VerbatimChar"/>
-                <w:rFonts w:ascii="Calibri" w:hAnsi="Calibri"/>
-                <w:sz w:val="16"/>
-              </w:rPr>
-              <w:t xml:space="preserve">31339674025</w:t>
+                <w:bCs/>
+                <w:rFonts w:ascii="Calibri" w:hAnsi="Calibri"/>
+                <w:b/>
+                <w:sz w:val="16"/>
+              </w:rPr>
+              <w:t xml:space="preserve">not</w:t>
             </w:r>
             <w:r>
               <w:rPr>
@@ -968,7 +940,7 @@
                 <w:rFonts w:ascii="Calibri" w:hAnsi="Calibri"/>
                 <w:sz w:val="16"/>
               </w:rPr>
-              <w:t xml:space="preserve">recorded 8 cases, 31 items, 234 field comparisons and 0 mismatches. UEQ-S was removed because repository/deployment permission was not established. Final main and the deployed commit must reproduce the result.</w:t>
+              <w:t xml:space="preserve">satisfy the supervisor's original “all four built-ins” denominator: UEQ-S was removed pending public-repository/deployment permission. The three-instrument release boundary requires explicit supervisor acceptance.</w:t>
             </w:r>
           </w:p>
         </w:tc>
@@ -1147,7 +1119,7 @@
                 <w:b/>
                 <w:sz w:val="16"/>
               </w:rPr>
-              <w:t xml:space="preserve">Evidenced in PR CI; final release verification pending.</w:t>
+              <w:t xml:space="preserve">Evidenced locally and in the last passing PR revision; final PR/release verification pending.</w:t>
             </w:r>
             <w:r>
               <w:rPr>
@@ -1161,36 +1133,7 @@
                 <w:rFonts w:ascii="Calibri" w:hAnsi="Calibri"/>
                 <w:sz w:val="16"/>
               </w:rPr>
-              <w:t xml:space="preserve">Run</w:t>
-            </w:r>
-            <w:r>
-              <w:rPr>
-                <w:rFonts w:ascii="Calibri" w:hAnsi="Calibri"/>
-                <w:sz w:val="16"/>
-              </w:rPr>
-              <w:t xml:space="preserve"> </w:t>
-            </w:r>
-            <w:r>
-              <w:rPr>
-                <w:rStyle w:val="VerbatimChar"/>
-                <w:rFonts w:ascii="Calibri" w:hAnsi="Calibri"/>
-                <w:sz w:val="16"/>
-              </w:rPr>
-              <w:t xml:space="preserve">31339674025</w:t>
-            </w:r>
-            <w:r>
-              <w:rPr>
-                <w:rFonts w:ascii="Calibri" w:hAnsi="Calibri"/>
-                <w:sz w:val="16"/>
-              </w:rPr>
-              <w:t xml:space="preserve"> </w:t>
-            </w:r>
-            <w:r>
-              <w:rPr>
-                <w:rFonts w:ascii="Calibri" w:hAnsi="Calibri"/>
-                <w:sz w:val="16"/>
-              </w:rPr>
-              <w:t xml:space="preserve">recorded 10 specific refusals, 2 generic parse refusals, 0 accepted documented losses and 0 silently altered.</w:t>
+              <w:t xml:space="preserve">The battery recorded 10 specific refusals, 2 generic parse refusals, 0 accepted documented losses and 0 silently altered.</w:t>
             </w:r>
           </w:p>
         </w:tc>
@@ -1784,7 +1727,7 @@
                 <w:b/>
                 <w:sz w:val="16"/>
               </w:rPr>
-              <w:t xml:space="preserve">Evidenced in PR CI; final release verification pending.</w:t>
+              <w:t xml:space="preserve">Evidenced locally and in the last passing PR revision; final PR/release verification pending.</w:t>
             </w:r>
             <w:r>
               <w:rPr>
@@ -1798,36 +1741,7 @@
                 <w:rFonts w:ascii="Calibri" w:hAnsi="Calibri"/>
                 <w:sz w:val="16"/>
               </w:rPr>
-              <w:t xml:space="preserve">Run</w:t>
-            </w:r>
-            <w:r>
-              <w:rPr>
-                <w:rFonts w:ascii="Calibri" w:hAnsi="Calibri"/>
-                <w:sz w:val="16"/>
-              </w:rPr>
-              <w:t xml:space="preserve"> </w:t>
-            </w:r>
-            <w:r>
-              <w:rPr>
-                <w:rStyle w:val="VerbatimChar"/>
-                <w:rFonts w:ascii="Calibri" w:hAnsi="Calibri"/>
-                <w:sz w:val="16"/>
-              </w:rPr>
-              <w:t xml:space="preserve">31339674025</w:t>
-            </w:r>
-            <w:r>
-              <w:rPr>
-                <w:rFonts w:ascii="Calibri" w:hAnsi="Calibri"/>
-                <w:sz w:val="16"/>
-              </w:rPr>
-              <w:t xml:space="preserve"> </w:t>
-            </w:r>
-            <w:r>
-              <w:rPr>
-                <w:rFonts w:ascii="Calibri" w:hAnsi="Calibri"/>
-                <w:sz w:val="16"/>
-              </w:rPr>
-              <w:t xml:space="preserve">passed stale-hash and delete-the-hash configuration/result tests and reconstructed 8/8 exports and 31/31 item responses with 0 mismatches. Final main and the deployed commit must reproduce the result.</w:t>
+              <w:t xml:space="preserve">Missing/mismatched Version 4 hashes were rejected, including link-load, submission and stored-result restoration routes; 8/8 exports and 31/31 responses reconstructed with 0 mismatch. Final main and deployed SHA must reproduce the result.</w:t>
             </w:r>
           </w:p>
         </w:tc>

</xml_diff>

<commit_message>
docs: harden observed researcher study protocol
</commit_message>
<xml_diff>
--- a/deliverables/AQP_Evaluation_Matrix_v6.docx
+++ b/deliverables/AQP_Evaluation_Matrix_v6.docx
@@ -2,7 +2,7 @@
 <file path=word/document.xml><?xml version="1.0" encoding="utf-8"?>
 <w:document xmlns:w="http://schemas.openxmlformats.org/wordprocessingml/2006/main" xmlns:m="http://schemas.openxmlformats.org/officeDocument/2006/math" xmlns:r="http://schemas.openxmlformats.org/officeDocument/2006/relationships" xmlns:o="urn:schemas-microsoft-com:office:office" xmlns:v="urn:schemas-microsoft-com:vml" xmlns:w10="urn:schemas-microsoft-com:office:word" xmlns:a="http://schemas.openxmlformats.org/drawingml/2006/main" xmlns:pic="http://schemas.openxmlformats.org/drawingml/2006/picture" xmlns:wp="http://schemas.openxmlformats.org/drawingml/2006/wordprocessingDrawing">
   <w:body>
-    <w:bookmarkStart w:id="22" w:name="aqp-evaluation-matrix-v6"/>
+    <w:bookmarkStart w:id="23" w:name="aqp-evaluation-matrix-v6"/>
     <w:p>
       <w:pPr>
         <w:pStyle w:val="Heading1"/>
@@ -28,7 +28,7 @@
         <w:rPr>
           <w:rFonts w:ascii="Calibri" w:hAnsi="Calibri"/>
         </w:rPr>
-        <w:t xml:space="preserve">Version: 6.2</w:t>
+        <w:t xml:space="preserve">Version: 6.4</w:t>
       </w:r>
       <w:r>
         <w:rPr>
@@ -480,21 +480,71 @@
                 <w:b/>
                 <w:sz w:val="16"/>
               </w:rPr>
-              <w:t xml:space="preserve">Evidenced locally; PR/final-release verification pending.</w:t>
-            </w:r>
-            <w:r>
-              <w:rPr>
-                <w:rFonts w:ascii="Calibri" w:hAnsi="Calibri"/>
-                <w:sz w:val="16"/>
-              </w:rPr>
-              <w:t xml:space="preserve"> </w:t>
-            </w:r>
-            <w:r>
-              <w:rPr>
-                <w:rFonts w:ascii="Calibri" w:hAnsi="Calibri"/>
-                <w:sz w:val="16"/>
-              </w:rPr>
-              <w:t xml:space="preserve">Five imported definitions completed as data with 0 instrument-specific production files, 96/96 shared case-contract executions used one function with 0 copies, and 16/16 allowlist combinations matched. The broader “questionnaire-independent” claim is withdrawn.</w:t>
+              <w:t xml:space="preserve">Evidenced for Draft PR candidate</w:t>
+            </w:r>
+            <w:r>
+              <w:rPr>
+                <w:bCs/>
+                <w:rFonts w:ascii="Calibri" w:hAnsi="Calibri"/>
+                <w:b/>
+                <w:sz w:val="16"/>
+              </w:rPr>
+              <w:t xml:space="preserve"> </w:t>
+            </w:r>
+            <w:r>
+              <w:rPr>
+                <w:rStyle w:val="VerbatimChar"/>
+                <w:bCs/>
+                <w:rFonts w:ascii="Calibri" w:hAnsi="Calibri"/>
+                <w:b/>
+                <w:sz w:val="16"/>
+              </w:rPr>
+              <w:t xml:space="preserve">816e1c4</w:t>
+            </w:r>
+            <w:r>
+              <w:rPr>
+                <w:bCs/>
+                <w:rFonts w:ascii="Calibri" w:hAnsi="Calibri"/>
+                <w:b/>
+                <w:sz w:val="16"/>
+              </w:rPr>
+              <w:t xml:space="preserve">; final main/release verification pending.</w:t>
+            </w:r>
+            <w:r>
+              <w:rPr>
+                <w:rFonts w:ascii="Calibri" w:hAnsi="Calibri"/>
+                <w:sz w:val="16"/>
+              </w:rPr>
+              <w:t xml:space="preserve"> </w:t>
+            </w:r>
+            <w:r>
+              <w:rPr>
+                <w:rFonts w:ascii="Calibri" w:hAnsi="Calibri"/>
+                <w:sz w:val="16"/>
+              </w:rPr>
+              <w:t xml:space="preserve">Five imported definitions completed as data with 0 instrument-specific production files, 96/96 shared case-contract executions used one function with 0 copies, and 16/16 allowlist combinations matched in CI run</w:t>
+            </w:r>
+            <w:r>
+              <w:rPr>
+                <w:rFonts w:ascii="Calibri" w:hAnsi="Calibri"/>
+                <w:sz w:val="16"/>
+              </w:rPr>
+              <w:t xml:space="preserve"> </w:t>
+            </w:r>
+            <w:hyperlink r:id="rId20">
+              <w:r>
+                <w:rPr>
+                  <w:rStyle w:val="Hyperlink"/>
+                </w:rPr>
+                <w:t xml:space="preserve">31377511113</w:t>
+              </w:r>
+            </w:hyperlink>
+            <w:r>
+              <w:rPr>
+                <w:rFonts w:ascii="Calibri" w:hAnsi="Calibri"/>
+                <w:sz w:val="16"/>
+              </w:rPr>
+              <w:t xml:space="preserve">. The broader “questionnaire-independent” claim is withdrawn.</w:t>
             </w:r>
           </w:p>
         </w:tc>
@@ -717,7 +767,87 @@
                 <w:rFonts w:ascii="Calibri" w:hAnsi="Calibri"/>
                 <w:sz w:val="16"/>
               </w:rPr>
-              <w:t xml:space="preserve">The earlier 60-scan run does not meet the expanded every-screen inventory. The 135-scan candidate is awaiting PR CI, and all manual route cells remain NT. No general accessibility or disabled-user benefit claim is available.</w:t>
+              <w:t xml:space="preserve">Draft PR candidate</w:t>
+            </w:r>
+            <w:r>
+              <w:rPr>
+                <w:rFonts w:ascii="Calibri" w:hAnsi="Calibri"/>
+                <w:sz w:val="16"/>
+              </w:rPr>
+              <w:t xml:space="preserve"> </w:t>
+            </w:r>
+            <w:r>
+              <w:rPr>
+                <w:rStyle w:val="VerbatimChar"/>
+                <w:rFonts w:ascii="Calibri" w:hAnsi="Calibri"/>
+                <w:sz w:val="16"/>
+              </w:rPr>
+              <w:t xml:space="preserve">816e1c4</w:t>
+            </w:r>
+            <w:r>
+              <w:rPr>
+                <w:rFonts w:ascii="Calibri" w:hAnsi="Calibri"/>
+                <w:sz w:val="16"/>
+              </w:rPr>
+              <w:t xml:space="preserve"> </w:t>
+            </w:r>
+            <w:r>
+              <w:rPr>
+                <w:rFonts w:ascii="Calibri" w:hAnsi="Calibri"/>
+                <w:sz w:val="16"/>
+              </w:rPr>
+              <w:t xml:space="preserve">completed 135/135 required scans with 0 automatically detected violations, 0 overflow failures, 0 critical target-size failures and 0 missing state/profile rows in run</w:t>
+            </w:r>
+            <w:r>
+              <w:rPr>
+                <w:rFonts w:ascii="Calibri" w:hAnsi="Calibri"/>
+                <w:sz w:val="16"/>
+              </w:rPr>
+              <w:t xml:space="preserve"> </w:t>
+            </w:r>
+            <w:hyperlink r:id="rId20">
+              <w:r>
+                <w:rPr>
+                  <w:rStyle w:val="Hyperlink"/>
+                </w:rPr>
+                <w:t xml:space="preserve">31377511113</w:t>
+              </w:r>
+            </w:hyperlink>
+            <w:r>
+              <w:rPr>
+                <w:rFonts w:ascii="Calibri" w:hAnsi="Calibri"/>
+                <w:sz w:val="16"/>
+              </w:rPr>
+              <w:t xml:space="preserve">. Axe returned 13 incomplete</w:t>
+            </w:r>
+            <w:r>
+              <w:rPr>
+                <w:rFonts w:ascii="Calibri" w:hAnsi="Calibri"/>
+                <w:sz w:val="16"/>
+              </w:rPr>
+              <w:t xml:space="preserve"> </w:t>
+            </w:r>
+            <w:r>
+              <w:rPr>
+                <w:rStyle w:val="VerbatimChar"/>
+                <w:rFonts w:ascii="Calibri" w:hAnsi="Calibri"/>
+                <w:sz w:val="16"/>
+              </w:rPr>
+              <w:t xml:space="preserve">color-contrast</w:t>
+            </w:r>
+            <w:r>
+              <w:rPr>
+                <w:rFonts w:ascii="Calibri" w:hAnsi="Calibri"/>
+                <w:sz w:val="16"/>
+              </w:rPr>
+              <w:t xml:space="preserve"> </w:t>
+            </w:r>
+            <w:r>
+              <w:rPr>
+                <w:rFonts w:ascii="Calibri" w:hAnsi="Calibri"/>
+                <w:sz w:val="16"/>
+              </w:rPr>
+              <w:t xml:space="preserve">scan results involving 20 gaze-state node occurrences because overlapping backgrounds could not be determined; the same target may occur in more than one state/profile row. Every target and failure summary is retained for manual inspection and none is counted as a pass. All manual route cells remain NT. No general accessibility or disabled-user benefit claim is available.</w:t>
             </w:r>
           </w:p>
         </w:tc>
@@ -896,21 +1026,71 @@
                 <w:b/>
                 <w:sz w:val="16"/>
               </w:rPr>
-              <w:t xml:space="preserve">Evidenced locally and in the last passing PR revision; final PR/release verification pending.</w:t>
-            </w:r>
-            <w:r>
-              <w:rPr>
-                <w:rFonts w:ascii="Calibri" w:hAnsi="Calibri"/>
-                <w:sz w:val="16"/>
-              </w:rPr>
-              <w:t xml:space="preserve"> </w:t>
-            </w:r>
-            <w:r>
-              <w:rPr>
-                <w:rFonts w:ascii="Calibri" w:hAnsi="Calibri"/>
-                <w:sz w:val="16"/>
-              </w:rPr>
-              <w:t xml:space="preserve">Eight cases, 31 items and 234 field comparisons produced 0 mismatches. This does</w:t>
+              <w:t xml:space="preserve">Evidenced for Draft PR candidate</w:t>
+            </w:r>
+            <w:r>
+              <w:rPr>
+                <w:bCs/>
+                <w:rFonts w:ascii="Calibri" w:hAnsi="Calibri"/>
+                <w:b/>
+                <w:sz w:val="16"/>
+              </w:rPr>
+              <w:t xml:space="preserve"> </w:t>
+            </w:r>
+            <w:r>
+              <w:rPr>
+                <w:rStyle w:val="VerbatimChar"/>
+                <w:bCs/>
+                <w:rFonts w:ascii="Calibri" w:hAnsi="Calibri"/>
+                <w:b/>
+                <w:sz w:val="16"/>
+              </w:rPr>
+              <w:t xml:space="preserve">816e1c4</w:t>
+            </w:r>
+            <w:r>
+              <w:rPr>
+                <w:bCs/>
+                <w:rFonts w:ascii="Calibri" w:hAnsi="Calibri"/>
+                <w:b/>
+                <w:sz w:val="16"/>
+              </w:rPr>
+              <w:t xml:space="preserve">; final main/release verification pending.</w:t>
+            </w:r>
+            <w:r>
+              <w:rPr>
+                <w:rFonts w:ascii="Calibri" w:hAnsi="Calibri"/>
+                <w:sz w:val="16"/>
+              </w:rPr>
+              <w:t xml:space="preserve"> </w:t>
+            </w:r>
+            <w:r>
+              <w:rPr>
+                <w:rFonts w:ascii="Calibri" w:hAnsi="Calibri"/>
+                <w:sz w:val="16"/>
+              </w:rPr>
+              <w:t xml:space="preserve">Eight cases, 31 items and 234 field comparisons produced 0 mismatches in run</w:t>
+            </w:r>
+            <w:r>
+              <w:rPr>
+                <w:rFonts w:ascii="Calibri" w:hAnsi="Calibri"/>
+                <w:sz w:val="16"/>
+              </w:rPr>
+              <w:t xml:space="preserve"> </w:t>
+            </w:r>
+            <w:hyperlink r:id="rId20">
+              <w:r>
+                <w:rPr>
+                  <w:rStyle w:val="Hyperlink"/>
+                </w:rPr>
+                <w:t xml:space="preserve">31377511113</w:t>
+              </w:r>
+            </w:hyperlink>
+            <w:r>
+              <w:rPr>
+                <w:rFonts w:ascii="Calibri" w:hAnsi="Calibri"/>
+                <w:sz w:val="16"/>
+              </w:rPr>
+              <w:t xml:space="preserve">. This does</w:t>
             </w:r>
             <w:r>
               <w:rPr>
@@ -1119,27 +1299,84 @@
                 <w:b/>
                 <w:sz w:val="16"/>
               </w:rPr>
-              <w:t xml:space="preserve">Evidenced locally and in the last passing PR revision; final PR/release verification pending.</w:t>
-            </w:r>
-            <w:r>
-              <w:rPr>
-                <w:rFonts w:ascii="Calibri" w:hAnsi="Calibri"/>
-                <w:sz w:val="16"/>
-              </w:rPr>
-              <w:t xml:space="preserve"> </w:t>
-            </w:r>
-            <w:r>
-              <w:rPr>
-                <w:rFonts w:ascii="Calibri" w:hAnsi="Calibri"/>
-                <w:sz w:val="16"/>
-              </w:rPr>
-              <w:t xml:space="preserve">The battery recorded 10 specific refusals, 2 generic parse refusals, 0 accepted documented losses and 0 silently altered.</w:t>
+              <w:t xml:space="preserve">Evidenced for Draft PR candidate</w:t>
+            </w:r>
+            <w:r>
+              <w:rPr>
+                <w:bCs/>
+                <w:rFonts w:ascii="Calibri" w:hAnsi="Calibri"/>
+                <w:b/>
+                <w:sz w:val="16"/>
+              </w:rPr>
+              <w:t xml:space="preserve"> </w:t>
+            </w:r>
+            <w:r>
+              <w:rPr>
+                <w:rStyle w:val="VerbatimChar"/>
+                <w:bCs/>
+                <w:rFonts w:ascii="Calibri" w:hAnsi="Calibri"/>
+                <w:b/>
+                <w:sz w:val="16"/>
+              </w:rPr>
+              <w:t xml:space="preserve">816e1c4</w:t>
+            </w:r>
+            <w:r>
+              <w:rPr>
+                <w:bCs/>
+                <w:rFonts w:ascii="Calibri" w:hAnsi="Calibri"/>
+                <w:b/>
+                <w:sz w:val="16"/>
+              </w:rPr>
+              <w:t xml:space="preserve">; final main/release verification pending.</w:t>
+            </w:r>
+            <w:r>
+              <w:rPr>
+                <w:rFonts w:ascii="Calibri" w:hAnsi="Calibri"/>
+                <w:sz w:val="16"/>
+              </w:rPr>
+              <w:t xml:space="preserve"> </w:t>
+            </w:r>
+            <w:r>
+              <w:rPr>
+                <w:rFonts w:ascii="Calibri" w:hAnsi="Calibri"/>
+                <w:sz w:val="16"/>
+              </w:rPr>
+              <w:t xml:space="preserve">Run</w:t>
+            </w:r>
+            <w:r>
+              <w:rPr>
+                <w:rFonts w:ascii="Calibri" w:hAnsi="Calibri"/>
+                <w:sz w:val="16"/>
+              </w:rPr>
+              <w:t xml:space="preserve"> </w:t>
+            </w:r>
+            <w:hyperlink r:id="rId20">
+              <w:r>
+                <w:rPr>
+                  <w:rStyle w:val="Hyperlink"/>
+                </w:rPr>
+                <w:t xml:space="preserve">31377511113</w:t>
+              </w:r>
+            </w:hyperlink>
+            <w:r>
+              <w:rPr>
+                <w:rFonts w:ascii="Calibri" w:hAnsi="Calibri"/>
+                <w:sz w:val="16"/>
+              </w:rPr>
+              <w:t xml:space="preserve"> </w:t>
+            </w:r>
+            <w:r>
+              <w:rPr>
+                <w:rFonts w:ascii="Calibri" w:hAnsi="Calibri"/>
+                <w:sz w:val="16"/>
+              </w:rPr>
+              <w:t xml:space="preserve">recorded 10 specific refusals, 2 generic parse refusals, 0 accepted documented losses and 0 silently altered.</w:t>
             </w:r>
           </w:p>
         </w:tc>
       </w:tr>
     </w:tbl>
-    <w:bookmarkStart w:id="20" w:name="active-claims-continued"/>
+    <w:bookmarkStart w:id="21" w:name="active-claims-continued"/>
     <w:p>
       <w:pPr>
         <w:pStyle w:val="Heading2"/>
@@ -1421,10 +1658,56 @@
             </w:pPr>
             <w:r>
               <w:rPr>
-                <w:rFonts w:ascii="Calibri" w:hAnsi="Calibri"/>
-                <w:sz w:val="16"/>
-              </w:rPr>
-              <w:t xml:space="preserve">Per condition: valid task completions ÷ assigned tasks; active time; assists; predefined errors; discrepancy detection; post-task SEQ. Post-session SUS. Report each participant and median/range. Second coder independently codes at least two recordings; report event-level agreement.</w:t>
+                <w:bCs/>
+                <w:rFonts w:ascii="Calibri" w:hAnsi="Calibri"/>
+                <w:b/>
+                <w:sz w:val="16"/>
+              </w:rPr>
+              <w:t xml:space="preserve">Per setup condition:</w:t>
+            </w:r>
+            <w:r>
+              <w:rPr>
+                <w:rFonts w:ascii="Calibri" w:hAnsi="Calibri"/>
+                <w:sz w:val="16"/>
+              </w:rPr>
+              <w:t xml:space="preserve"> </w:t>
+            </w:r>
+            <w:r>
+              <w:rPr>
+                <w:rFonts w:ascii="Calibri" w:hAnsi="Calibri"/>
+                <w:sz w:val="16"/>
+              </w:rPr>
+              <w:t xml:space="preserve">checkpoint-valid completions ÷ assigned attempts; active setup time ending at declaration/20-minute limit; assists; predefined errors and critical status; immediate post-condition SEQ and SUS. After both post-condition sheets, the observer runs an untimed fixed-vector link/identity/score/export verification for each preserved setup.</w:t>
+            </w:r>
+            <w:r>
+              <w:rPr>
+                <w:rFonts w:ascii="Calibri" w:hAnsi="Calibri"/>
+                <w:sz w:val="16"/>
+              </w:rPr>
+              <w:t xml:space="preserve"> </w:t>
+            </w:r>
+            <w:r>
+              <w:rPr>
+                <w:bCs/>
+                <w:rFonts w:ascii="Calibri" w:hAnsi="Calibri"/>
+                <w:b/>
+                <w:sz w:val="16"/>
+              </w:rPr>
+              <w:t xml:space="preserve">Separate AQP source-review task:</w:t>
+            </w:r>
+            <w:r>
+              <w:rPr>
+                <w:rFonts w:ascii="Calibri" w:hAnsi="Calibri"/>
+                <w:sz w:val="16"/>
+              </w:rPr>
+              <w:t xml:space="preserve"> </w:t>
+            </w:r>
+            <w:r>
+              <w:rPr>
+                <w:rFonts w:ascii="Calibri" w:hAnsi="Calibri"/>
+                <w:sz w:val="16"/>
+              </w:rPr>
+              <w:t xml:space="preserve">discrepancy detection, time, assists and false positives. Report every participant and n/median/minimum/maximum. A second coder independently codes at least two recordings using one-to-one same-category event matching within 10 seconds.</w:t>
             </w:r>
           </w:p>
         </w:tc>
@@ -1450,7 +1733,7 @@
                 <w:rFonts w:ascii="Calibri" w:hAnsi="Calibri"/>
                 <w:sz w:val="16"/>
               </w:rPr>
-              <w:t xml:space="preserve">A task succeeds only when the specified end state and all validity checks are met without critical error. Assistance and errors follow frozen definitions. Report descriptive results only; no significance test or general usability claim at n=6–8.</w:t>
+              <w:t xml:space="preserve">A task succeeds only when every frozen platform-specific end-state check passes after the observer's synthetic verification. An unrecovered error is critical when it fails a checkpoint or leaves an incorrect identity, scoring rule, response value or unusable link. Eight AQ/QA slots are generated and concealed before recruitment; later allocation is not adapted to outcomes. Report descriptive results only; no significance test or general usability claim at n=6–8.</w:t>
             </w:r>
           </w:p>
         </w:tc>
@@ -1476,7 +1759,7 @@
                 <w:rFonts w:ascii="Calibri" w:hAnsi="Calibri"/>
                 <w:sz w:val="16"/>
               </w:rPr>
-              <w:t xml:space="preserve">Preregistered observed-study protocol; recordings with consent; observer logs; independent-coder sheet; SEQ/SUS forms.</w:t>
+              <w:t xml:space="preserve">Preregistered observed-study protocol and end-state map; recordings with consent; observer/coder logs; fixed Post-Condition Measures Sheet with raw SEQ/SUS responses.</w:t>
             </w:r>
           </w:p>
         </w:tc>
@@ -1518,7 +1801,7 @@
                 <w:rFonts w:ascii="Calibri" w:hAnsi="Calibri"/>
                 <w:sz w:val="16"/>
               </w:rPr>
-              <w:t xml:space="preserve">No sessions may run without amendment approval. If approval/timing does not permit, retain the fully specified protocol as planned work and keep C5 Not evidenced.</w:t>
+              <w:t xml:space="preserve">Protocol v1.2 is method-ready, but no sessions may run without written amendment approval and completed activation gates. If approval/timing does not permit, retain it as planned work and keep C5 Not evidenced.</w:t>
             </w:r>
           </w:p>
         </w:tc>
@@ -1727,28 +2010,78 @@
                 <w:b/>
                 <w:sz w:val="16"/>
               </w:rPr>
-              <w:t xml:space="preserve">Evidenced locally and in the last passing PR revision; final PR/release verification pending.</w:t>
-            </w:r>
-            <w:r>
-              <w:rPr>
-                <w:rFonts w:ascii="Calibri" w:hAnsi="Calibri"/>
-                <w:sz w:val="16"/>
-              </w:rPr>
-              <w:t xml:space="preserve"> </w:t>
-            </w:r>
-            <w:r>
-              <w:rPr>
-                <w:rFonts w:ascii="Calibri" w:hAnsi="Calibri"/>
-                <w:sz w:val="16"/>
-              </w:rPr>
-              <w:t xml:space="preserve">Missing/mismatched Version 4 hashes were rejected, including link-load, submission and stored-result restoration routes; 8/8 exports and 31/31 responses reconstructed with 0 mismatch. Final main and deployed SHA must reproduce the result.</w:t>
+              <w:t xml:space="preserve">Evidenced for Draft PR candidate</w:t>
+            </w:r>
+            <w:r>
+              <w:rPr>
+                <w:bCs/>
+                <w:rFonts w:ascii="Calibri" w:hAnsi="Calibri"/>
+                <w:b/>
+                <w:sz w:val="16"/>
+              </w:rPr>
+              <w:t xml:space="preserve"> </w:t>
+            </w:r>
+            <w:r>
+              <w:rPr>
+                <w:rStyle w:val="VerbatimChar"/>
+                <w:bCs/>
+                <w:rFonts w:ascii="Calibri" w:hAnsi="Calibri"/>
+                <w:b/>
+                <w:sz w:val="16"/>
+              </w:rPr>
+              <w:t xml:space="preserve">816e1c4</w:t>
+            </w:r>
+            <w:r>
+              <w:rPr>
+                <w:bCs/>
+                <w:rFonts w:ascii="Calibri" w:hAnsi="Calibri"/>
+                <w:b/>
+                <w:sz w:val="16"/>
+              </w:rPr>
+              <w:t xml:space="preserve">; final main/release verification pending.</w:t>
+            </w:r>
+            <w:r>
+              <w:rPr>
+                <w:rFonts w:ascii="Calibri" w:hAnsi="Calibri"/>
+                <w:sz w:val="16"/>
+              </w:rPr>
+              <w:t xml:space="preserve"> </w:t>
+            </w:r>
+            <w:r>
+              <w:rPr>
+                <w:rFonts w:ascii="Calibri" w:hAnsi="Calibri"/>
+                <w:sz w:val="16"/>
+              </w:rPr>
+              <w:t xml:space="preserve">Missing/mismatched Version 4 hashes were rejected in CI, including link-load, submission and stored-result restoration routes; 8/8 exports and 31/31 responses reconstructed with 0 mismatch in run</w:t>
+            </w:r>
+            <w:r>
+              <w:rPr>
+                <w:rFonts w:ascii="Calibri" w:hAnsi="Calibri"/>
+                <w:sz w:val="16"/>
+              </w:rPr>
+              <w:t xml:space="preserve"> </w:t>
+            </w:r>
+            <w:hyperlink r:id="rId20">
+              <w:r>
+                <w:rPr>
+                  <w:rStyle w:val="Hyperlink"/>
+                </w:rPr>
+                <w:t xml:space="preserve">31377511113</w:t>
+              </w:r>
+            </w:hyperlink>
+            <w:r>
+              <w:rPr>
+                <w:rFonts w:ascii="Calibri" w:hAnsi="Calibri"/>
+                <w:sz w:val="16"/>
+              </w:rPr>
+              <w:t xml:space="preserve">. Final main and deployed SHA must reproduce the result.</w:t>
             </w:r>
           </w:p>
         </w:tc>
       </w:tr>
     </w:tbl>
-    <w:bookmarkEnd w:id="20"/>
-    <w:bookmarkStart w:id="21" w:name="removed-row"/>
+    <w:bookmarkEnd w:id="21"/>
+    <w:bookmarkStart w:id="22" w:name="removed-row"/>
     <w:p>
       <w:pPr>
         <w:pStyle w:val="Heading2"/>
@@ -1827,13 +2160,11 @@
         <w:t xml:space="preserve">retained as an unevidenced active claim.</w:t>
       </w:r>
     </w:p>
-    <w:bookmarkEnd w:id="21"/>
     <w:bookmarkEnd w:id="22"/>
+    <w:bookmarkEnd w:id="23"/>
     <w:sectPr>
       <w:headerReference w:type="default" r:id="rId9"/>
       <w:footerReference w:type="default" r:id="rId10"/>
-      <w:headerReference w:type="even" r:id="rId11"/>
-      <w:footerReference w:type="even" r:id="rId12"/>
       <w:pgSz w:orient="landscape" w:w="15840" w:h="12240"/>
       <w:pgMar w:top="1008" w:bottom="1008" w:left="864" w:right="864" w:header="708" w:footer="708"/>
     </w:sectPr>
@@ -1846,18 +2177,6 @@
 </file>
 
 <file path=word/footer1.xml><?xml version="1.0" encoding="utf-8"?>
-<w:ftr xmlns:m="http://schemas.openxmlformats.org/officeDocument/2006/math" xmlns:mc="http://schemas.openxmlformats.org/markup-compatibility/2006" xmlns:mo="http://schemas.microsoft.com/office/mac/office/2008/main" xmlns:mv="urn:schemas-microsoft-com:mac:vml" xmlns:o="urn:schemas-microsoft-com:office:office" xmlns:r="http://schemas.openxmlformats.org/officeDocument/2006/relationships" xmlns:v="urn:schemas-microsoft-com:vml" xmlns:w10="urn:schemas-microsoft-com:office:word" xmlns:w14="http://schemas.microsoft.com/office/word/2010/wordml" xmlns:w="http://schemas.openxmlformats.org/wordprocessingml/2006/main" xmlns:wne="http://schemas.microsoft.com/office/word/2006/wordml" xmlns:wp14="http://schemas.microsoft.com/office/word/2010/wordprocessingDrawing" xmlns:wp="http://schemas.openxmlformats.org/drawingml/2006/wordprocessingDrawing" xmlns:wpc="http://schemas.microsoft.com/office/word/2010/wordprocessingCanvas" xmlns:wpg="http://schemas.microsoft.com/office/word/2010/wordprocessingGroup" xmlns:wpi="http://schemas.microsoft.com/office/word/2010/wordprocessingInk" xmlns:wps="http://schemas.microsoft.com/office/word/2010/wordprocessingShape" mc:Ignorable="w14 wp14">
-  <w:p>
-    <w:pPr>
-      <w:pStyle w:val="Footer"/>
-      <w:jc w:val="center"/>
-    </w:pPr>
-    <w:r/>
-  </w:p>
-</w:ftr>
-</file>
-
-<file path=word/footer2.xml><?xml version="1.0" encoding="utf-8"?>
 <w:ftr xmlns:m="http://schemas.openxmlformats.org/officeDocument/2006/math" xmlns:mc="http://schemas.openxmlformats.org/markup-compatibility/2006" xmlns:mo="http://schemas.microsoft.com/office/mac/office/2008/main" xmlns:mv="urn:schemas-microsoft-com:mac:vml" xmlns:o="urn:schemas-microsoft-com:office:office" xmlns:r="http://schemas.openxmlformats.org/officeDocument/2006/relationships" xmlns:v="urn:schemas-microsoft-com:vml" xmlns:w10="urn:schemas-microsoft-com:office:word" xmlns:w14="http://schemas.microsoft.com/office/word/2010/wordml" xmlns:w="http://schemas.openxmlformats.org/wordprocessingml/2006/main" xmlns:wne="http://schemas.microsoft.com/office/word/2006/wordml" xmlns:wp14="http://schemas.microsoft.com/office/word/2010/wordprocessingDrawing" xmlns:wp="http://schemas.openxmlformats.org/drawingml/2006/wordprocessingDrawing" xmlns:wpc="http://schemas.microsoft.com/office/word/2010/wordprocessingCanvas" xmlns:wpg="http://schemas.microsoft.com/office/word/2010/wordprocessingGroup" xmlns:wpi="http://schemas.microsoft.com/office/word/2010/wordprocessingInk" xmlns:wps="http://schemas.microsoft.com/office/word/2010/wordprocessingShape" mc:Ignorable="w14 wp14">
   <w:p>
     <w:pPr>
@@ -1889,19 +2208,6 @@
 </file>
 
 <file path=word/header1.xml><?xml version="1.0" encoding="utf-8"?>
-<w:hdr xmlns:m="http://schemas.openxmlformats.org/officeDocument/2006/math" xmlns:mc="http://schemas.openxmlformats.org/markup-compatibility/2006" xmlns:mo="http://schemas.microsoft.com/office/mac/office/2008/main" xmlns:mv="urn:schemas-microsoft-com:mac:vml" xmlns:o="urn:schemas-microsoft-com:office:office" xmlns:r="http://schemas.openxmlformats.org/officeDocument/2006/relationships" xmlns:v="urn:schemas-microsoft-com:vml" xmlns:w10="urn:schemas-microsoft-com:office:word" xmlns:w14="http://schemas.microsoft.com/office/word/2010/wordml" xmlns:w="http://schemas.openxmlformats.org/wordprocessingml/2006/main" xmlns:wne="http://schemas.microsoft.com/office/word/2006/wordml" xmlns:wp14="http://schemas.microsoft.com/office/word/2010/wordprocessingDrawing" xmlns:wp="http://schemas.openxmlformats.org/drawingml/2006/wordprocessingDrawing" xmlns:wpc="http://schemas.microsoft.com/office/word/2010/wordprocessingCanvas" xmlns:wpg="http://schemas.microsoft.com/office/word/2010/wordprocessingGroup" xmlns:wpi="http://schemas.microsoft.com/office/word/2010/wordprocessingInk" xmlns:wps="http://schemas.microsoft.com/office/word/2010/wordprocessingShape" mc:Ignorable="w14 wp14">
-  <w:p>
-    <w:pPr>
-      <w:pStyle w:val="Header"/>
-      <w:spacing w:after="0"/>
-      <w:jc w:val="left"/>
-    </w:pPr>
-    <w:r/>
-  </w:p>
-</w:hdr>
-</file>
-
-<file path=word/header2.xml><?xml version="1.0" encoding="utf-8"?>
 <w:hdr xmlns:m="http://schemas.openxmlformats.org/officeDocument/2006/math" xmlns:mc="http://schemas.openxmlformats.org/markup-compatibility/2006" xmlns:mo="http://schemas.microsoft.com/office/mac/office/2008/main" xmlns:mv="urn:schemas-microsoft-com:mac:vml" xmlns:o="urn:schemas-microsoft-com:office:office" xmlns:r="http://schemas.openxmlformats.org/officeDocument/2006/relationships" xmlns:v="urn:schemas-microsoft-com:vml" xmlns:w10="urn:schemas-microsoft-com:office:word" xmlns:w14="http://schemas.microsoft.com/office/word/2010/wordml" xmlns:w="http://schemas.openxmlformats.org/wordprocessingml/2006/main" xmlns:wne="http://schemas.microsoft.com/office/word/2006/wordml" xmlns:wp14="http://schemas.microsoft.com/office/word/2010/wordprocessingDrawing" xmlns:wp="http://schemas.openxmlformats.org/drawingml/2006/wordprocessingDrawing" xmlns:wpc="http://schemas.microsoft.com/office/word/2010/wordprocessingCanvas" xmlns:wpg="http://schemas.microsoft.com/office/word/2010/wordprocessingGroup" xmlns:wpi="http://schemas.microsoft.com/office/word/2010/wordprocessingInk" xmlns:wps="http://schemas.microsoft.com/office/word/2010/wordprocessingShape" mc:Ignorable="w14 wp14">
   <w:p>
     <w:pPr>

</xml_diff>

<commit_message>
docs: align final feedback acceptance status
</commit_message>
<xml_diff>
--- a/deliverables/AQP_Evaluation_Matrix_v6.docx
+++ b/deliverables/AQP_Evaluation_Matrix_v6.docx
@@ -28,7 +28,7 @@
         <w:rPr>
           <w:rFonts w:ascii="Calibri" w:hAnsi="Calibri"/>
         </w:rPr>
-        <w:t xml:space="preserve">Version: 6.4</w:t>
+        <w:t xml:space="preserve">Version: 6.5</w:t>
       </w:r>
       <w:r>
         <w:rPr>
@@ -499,7 +499,7 @@
                 <w:b/>
                 <w:sz w:val="16"/>
               </w:rPr>
-              <w:t xml:space="preserve">816e1c4</w:t>
+              <w:t xml:space="preserve">4fe422c</w:t>
             </w:r>
             <w:r>
               <w:rPr>
@@ -536,7 +536,7 @@
                 <w:rPr>
                   <w:rStyle w:val="Hyperlink"/>
                 </w:rPr>
-                <w:t xml:space="preserve">31377511113</w:t>
+                <w:t xml:space="preserve">31399712181</w:t>
               </w:r>
             </w:hyperlink>
             <w:r>
@@ -782,7 +782,7 @@
                 <w:rFonts w:ascii="Calibri" w:hAnsi="Calibri"/>
                 <w:sz w:val="16"/>
               </w:rPr>
-              <w:t xml:space="preserve">816e1c4</w:t>
+              <w:t xml:space="preserve">4fe422c</w:t>
             </w:r>
             <w:r>
               <w:rPr>
@@ -810,7 +810,7 @@
                 <w:rPr>
                   <w:rStyle w:val="Hyperlink"/>
                 </w:rPr>
-                <w:t xml:space="preserve">31377511113</w:t>
+                <w:t xml:space="preserve">31399712181</w:t>
               </w:r>
             </w:hyperlink>
             <w:r>
@@ -1026,7 +1026,7 @@
                 <w:b/>
                 <w:sz w:val="16"/>
               </w:rPr>
-              <w:t xml:space="preserve">Evidenced for Draft PR candidate</w:t>
+              <w:t xml:space="preserve">Partially evidenced for Draft PR candidate</w:t>
             </w:r>
             <w:r>
               <w:rPr>
@@ -1045,7 +1045,7 @@
                 <w:b/>
                 <w:sz w:val="16"/>
               </w:rPr>
-              <w:t xml:space="preserve">816e1c4</w:t>
+              <w:t xml:space="preserve">4fe422c</w:t>
             </w:r>
             <w:r>
               <w:rPr>
@@ -1082,7 +1082,7 @@
                 <w:rPr>
                   <w:rStyle w:val="Hyperlink"/>
                 </w:rPr>
-                <w:t xml:space="preserve">31377511113</w:t>
+                <w:t xml:space="preserve">31399712181</w:t>
               </w:r>
             </w:hyperlink>
             <w:r>
@@ -1318,7 +1318,7 @@
                 <w:b/>
                 <w:sz w:val="16"/>
               </w:rPr>
-              <w:t xml:space="preserve">816e1c4</w:t>
+              <w:t xml:space="preserve">4fe422c</w:t>
             </w:r>
             <w:r>
               <w:rPr>
@@ -1355,7 +1355,7 @@
                 <w:rPr>
                   <w:rStyle w:val="Hyperlink"/>
                 </w:rPr>
-                <w:t xml:space="preserve">31377511113</w:t>
+                <w:t xml:space="preserve">31399712181</w:t>
               </w:r>
             </w:hyperlink>
             <w:r>
@@ -2029,7 +2029,7 @@
                 <w:b/>
                 <w:sz w:val="16"/>
               </w:rPr>
-              <w:t xml:space="preserve">816e1c4</w:t>
+              <w:t xml:space="preserve">4fe422c</w:t>
             </w:r>
             <w:r>
               <w:rPr>
@@ -2066,7 +2066,7 @@
                 <w:rPr>
                   <w:rStyle w:val="Hyperlink"/>
                 </w:rPr>
-                <w:t xml:space="preserve">31377511113</w:t>
+                <w:t xml:space="preserve">31399712181</w:t>
               </w:r>
             </w:hyperlink>
             <w:r>

</xml_diff>